<commit_message>
Add 4 API import/export, restore/backup
</commit_message>
<xml_diff>
--- a/BE_QLTT/docs/DA-FE&BE.docx
+++ b/BE_QLTT/docs/DA-FE&BE.docx
@@ -1,5 +1,40 @@
 
-<file path=word/document.xml><?xml version="1.0" encoding="utf-8"?>
+<file path=docProps\app.xml><?xml version="1.0" encoding="utf-8"?>
+<Properties xmlns="http://schemas.openxmlformats.org/officeDocument/2006/extended-properties" xmlns:vt="http://schemas.openxmlformats.org/officeDocument/2006/docPropsVTypes">
+  <Template>Normal.dotm</Template>
+  <TotalTime>26</TotalTime>
+  <Pages>3</Pages>
+  <Words>813</Words>
+  <Characters>4639</Characters>
+  <Application>Microsoft Office Word</Application>
+  <DocSecurity>0</DocSecurity>
+  <Lines>38</Lines>
+  <Paragraphs>10</Paragraphs>
+  <ScaleCrop>false</ScaleCrop>
+  <Company/>
+  <LinksUpToDate>false</LinksUpToDate>
+  <CharactersWithSpaces>5442</CharactersWithSpaces>
+  <SharedDoc>false</SharedDoc>
+  <HyperlinksChanged>false</HyperlinksChanged>
+  <AppVersion>16.0000</AppVersion>
+</Properties>
+</file>
+
+<file path=docProps\core.xml><?xml version="1.0" encoding="utf-8"?>
+<cp:coreProperties xmlns:cp="http://schemas.openxmlformats.org/package/2006/metadata/core-properties" xmlns:dc="http://purl.org/dc/elements/1.1/" xmlns:dcterms="http://purl.org/dc/terms/" xmlns:dcmitype="http://purl.org/dc/dcmitype/" xmlns:xsi="http://www.w3.org/2001/XMLSchema-instance">
+  <dc:title/>
+  <dc:subject/>
+  <dc:creator>Nguyễn Bằng Phi</dc:creator>
+  <cp:keywords/>
+  <dc:description/>
+  <cp:lastModifiedBy>Nguyễn Bằng Phi</cp:lastModifiedBy>
+  <cp:revision>5</cp:revision>
+  <dcterms:created xsi:type="dcterms:W3CDTF">2026-09-24T10:00:00Z</dcterms:created>
+  <dcterms:modified xsi:type="dcterms:W3CDTF">2026-09-24T10:44:00Z</dcterms:modified>
+</cp:coreProperties>
+</file>
+
+<file path=word\document.xml><?xml version="1.0" encoding="utf-8"?>
 <w:document xmlns:wpc="http://schemas.microsoft.com/office/word/2010/wordprocessingCanvas" xmlns:cx="http://schemas.microsoft.com/office/drawing/2014/chartex" xmlns:cx1="http://schemas.microsoft.com/office/drawing/2015/9/8/chartex" xmlns:cx2="http://schemas.microsoft.com/office/drawing/2015/10/21/chartex" xmlns:cx3="http://schemas.microsoft.com/office/drawing/2016/5/9/chartex" xmlns:cx4="http://schemas.microsoft.com/office/drawing/2016/5/10/chartex" xmlns:cx5="http://schemas.microsoft.com/office/drawing/2016/5/11/chartex" xmlns:cx6="http://schemas.microsoft.com/office/drawing/2016/5/12/chartex" xmlns:cx7="http://schemas.microsoft.com/office/drawing/2016/5/13/chartex" xmlns:cx8="http://schemas.microsoft.com/office/drawing/2016/5/14/chartex" xmlns:mc="http://schemas.openxmlformats.org/markup-compatibility/2006" xmlns:aink="http://schemas.microsoft.com/office/drawing/2016/ink" xmlns:am3d="http://schemas.microsoft.com/office/drawing/2017/model3d" xmlns:o="urn:schemas-microsoft-com:office:office" xmlns:r="http://schemas.openxmlformats.org/officeDocument/2006/relationships" xmlns:m="http://schemas.openxmlformats.org/officeDocument/2006/math" xmlns:v="urn:schemas-microsoft-com:vml" xmlns:wp14="http://schemas.microsoft.com/office/word/2010/wordprocessingDrawing" xmlns:wp="http://schemas.openxmlformats.org/drawingml/2006/wordprocessingDrawing" xmlns:w10="urn:schemas-microsoft-com:office:word" xmlns:w="http://schemas.openxmlformats.org/wordprocessingml/2006/main" xmlns:w14="http://schemas.microsoft.com/office/word/2010/wordml" xmlns:w15="http://schemas.microsoft.com/office/word/2012/wordml" xmlns:w16cid="http://schemas.microsoft.com/office/word/2016/wordml/cid" xmlns:w16se="http://schemas.microsoft.com/office/word/2015/wordml/symex" xmlns:wpg="http://schemas.microsoft.com/office/word/2010/wordprocessingGroup" xmlns:wpi="http://schemas.microsoft.com/office/word/2010/wordprocessingInk" xmlns:wne="http://schemas.microsoft.com/office/word/2006/wordml" xmlns:wps="http://schemas.microsoft.com/office/word/2010/wordprocessingShape" mc:Ignorable="w14 w15 w16se w16cid wp14">
   <w:body>
     <w:p>
@@ -1177,6 +1212,90 @@
       </w:r>
       <w:r>
         <w:t xml:space="preserve"> là đến hạn (bao gồm cả hạn chót trong hôm nay).</w:t>
+      </w:r>
+    </w:p>
+    <w:p>
+      <w:pPr>
+        <w:pStyle w:val="NormalWeb"/>
+      </w:pPr>
+      <w:r>
+        <w:rPr>
+          <w:b/>
+          <w:bCs/>
+        </w:rPr>
+        <w:t>Nhóm 6: Dữ liệu (Backup, Restore, Import, Export)</w:t>
+      </w:r>
+    </w:p>
+    <w:p>
+      <w:pPr>
+        <w:pStyle w:val="NormalWeb"/>
+        <w:numPr>
+          <w:ilvl w:val="0"/>
+          <w:numId w:val="29"/>
+        </w:numPr>
+      </w:pPr>
+      <w:r>
+        <w:rPr>
+          <w:rStyle w:val="HTMLCode"/>
+        </w:rPr>
+        <w:t>POST /api/system/import</w:t>
+      </w:r>
+      <w:r>
+        <w:t>: (Admin) Import dữ liệu.</w:t>
+      </w:r>
+    </w:p>
+    <w:p>
+      <w:pPr>
+        <w:pStyle w:val="NormalWeb"/>
+        <w:numPr>
+          <w:ilvl w:val="0"/>
+          <w:numId w:val="29"/>
+        </w:numPr>
+      </w:pPr>
+      <w:r>
+        <w:rPr>
+          <w:rStyle w:val="HTMLCode"/>
+        </w:rPr>
+        <w:t>POST /api/system/export</w:t>
+      </w:r>
+      <w:r>
+        <w:t>: (Admin) Export dữ liệu.</w:t>
+      </w:r>
+    </w:p>
+    <w:p>
+      <w:pPr>
+        <w:pStyle w:val="NormalWeb"/>
+        <w:numPr>
+          <w:ilvl w:val="0"/>
+          <w:numId w:val="29"/>
+        </w:numPr>
+      </w:pPr>
+      <w:r>
+        <w:rPr>
+          <w:rStyle w:val="HTMLCode"/>
+        </w:rPr>
+        <w:t>POST /api/system/restore</w:t>
+      </w:r>
+      <w:r>
+        <w:t>: (Admin) Restore dữ liệu.</w:t>
+      </w:r>
+    </w:p>
+    <w:p>
+      <w:pPr>
+        <w:pStyle w:val="NormalWeb"/>
+        <w:numPr>
+          <w:ilvl w:val="0"/>
+          <w:numId w:val="29"/>
+        </w:numPr>
+      </w:pPr>
+      <w:r>
+        <w:rPr>
+          <w:rStyle w:val="HTMLCode"/>
+        </w:rPr>
+        <w:t>POST /api/system/backup</w:t>
+      </w:r>
+      <w:r>
+        <w:t>: (Admin) Backup dữ liệu.</w:t>
       </w:r>
     </w:p>
     <w:p/>
@@ -1190,7 +1309,54 @@
 </w:document>
 </file>
 
-<file path=word/numbering.xml><?xml version="1.0" encoding="utf-8"?>
+<file path=word\fontTable.xml><?xml version="1.0" encoding="utf-8"?>
+<w:fonts xmlns:mc="http://schemas.openxmlformats.org/markup-compatibility/2006" xmlns:r="http://schemas.openxmlformats.org/officeDocument/2006/relationships" xmlns:w="http://schemas.openxmlformats.org/wordprocessingml/2006/main" xmlns:w14="http://schemas.microsoft.com/office/word/2010/wordml" xmlns:w15="http://schemas.microsoft.com/office/word/2012/wordml" xmlns:w16cid="http://schemas.microsoft.com/office/word/2016/wordml/cid" xmlns:w16se="http://schemas.microsoft.com/office/word/2015/wordml/symex" mc:Ignorable="w14 w15 w16se w16cid">
+  <w:font w:name="Symbol">
+    <w:panose1 w:val="05050102010706020507"/>
+    <w:charset w:val="02"/>
+    <w:family w:val="roman"/>
+    <w:pitch w:val="variable"/>
+    <w:sig w:usb0="00000000" w:usb1="10000000" w:usb2="00000000" w:usb3="00000000" w:csb0="80000000" w:csb1="00000000"/>
+  </w:font>
+  <w:font w:name="Times New Roman">
+    <w:panose1 w:val="02020603050405020304"/>
+    <w:charset w:val="00"/>
+    <w:family w:val="roman"/>
+    <w:pitch w:val="variable"/>
+    <w:sig w:usb0="E0002EFF" w:usb1="C000785B" w:usb2="00000009" w:usb3="00000000" w:csb0="000001FF" w:csb1="00000000"/>
+  </w:font>
+  <w:font w:name="Courier New">
+    <w:panose1 w:val="02070309020205020404"/>
+    <w:charset w:val="00"/>
+    <w:family w:val="modern"/>
+    <w:pitch w:val="fixed"/>
+    <w:sig w:usb0="E0002EFF" w:usb1="C0007843" w:usb2="00000009" w:usb3="00000000" w:csb0="000001FF" w:csb1="00000000"/>
+  </w:font>
+  <w:font w:name="Wingdings">
+    <w:panose1 w:val="05000000000000000000"/>
+    <w:charset w:val="02"/>
+    <w:family w:val="auto"/>
+    <w:pitch w:val="variable"/>
+    <w:sig w:usb0="00000000" w:usb1="10000000" w:usb2="00000000" w:usb3="00000000" w:csb0="80000000" w:csb1="00000000"/>
+  </w:font>
+  <w:font w:name="Calibri">
+    <w:panose1 w:val="020F0502020204030204"/>
+    <w:charset w:val="00"/>
+    <w:family w:val="swiss"/>
+    <w:pitch w:val="variable"/>
+    <w:sig w:usb0="E4002EFF" w:usb1="C000247B" w:usb2="00000009" w:usb3="00000000" w:csb0="000001FF" w:csb1="00000000"/>
+  </w:font>
+  <w:font w:name="Calibri Light">
+    <w:panose1 w:val="020F0302020204030204"/>
+    <w:charset w:val="00"/>
+    <w:family w:val="swiss"/>
+    <w:pitch w:val="variable"/>
+    <w:sig w:usb0="E4002EFF" w:usb1="C000247B" w:usb2="00000009" w:usb3="00000000" w:csb0="000001FF" w:csb1="00000000"/>
+  </w:font>
+</w:fonts>
+</file>
+
+<file path=word\numbering.xml><?xml version="1.0" encoding="utf-8"?>
 <w:numbering xmlns:wpc="http://schemas.microsoft.com/office/word/2010/wordprocessingCanvas" xmlns:cx="http://schemas.microsoft.com/office/drawing/2014/chartex" xmlns:cx1="http://schemas.microsoft.com/office/drawing/2015/9/8/chartex" xmlns:cx2="http://schemas.microsoft.com/office/drawing/2015/10/21/chartex" xmlns:cx3="http://schemas.microsoft.com/office/drawing/2016/5/9/chartex" xmlns:cx4="http://schemas.microsoft.com/office/drawing/2016/5/10/chartex" xmlns:cx5="http://schemas.microsoft.com/office/drawing/2016/5/11/chartex" xmlns:cx6="http://schemas.microsoft.com/office/drawing/2016/5/12/chartex" xmlns:cx7="http://schemas.microsoft.com/office/drawing/2016/5/13/chartex" xmlns:cx8="http://schemas.microsoft.com/office/drawing/2016/5/14/chartex" xmlns:mc="http://schemas.openxmlformats.org/markup-compatibility/2006" xmlns:aink="http://schemas.microsoft.com/office/drawing/2016/ink" xmlns:am3d="http://schemas.microsoft.com/office/drawing/2017/model3d" xmlns:o="urn:schemas-microsoft-com:office:office" xmlns:r="http://schemas.openxmlformats.org/officeDocument/2006/relationships" xmlns:m="http://schemas.openxmlformats.org/officeDocument/2006/math" xmlns:v="urn:schemas-microsoft-com:vml" xmlns:wp14="http://schemas.microsoft.com/office/word/2010/wordprocessingDrawing" xmlns:wp="http://schemas.openxmlformats.org/drawingml/2006/wordprocessingDrawing" xmlns:w10="urn:schemas-microsoft-com:office:word" xmlns:w="http://schemas.openxmlformats.org/wordprocessingml/2006/main" xmlns:w14="http://schemas.microsoft.com/office/word/2010/wordml" xmlns:w15="http://schemas.microsoft.com/office/word/2012/wordml" xmlns:w16cid="http://schemas.microsoft.com/office/word/2016/wordml/cid" xmlns:w16se="http://schemas.microsoft.com/office/word/2015/wordml/symex" xmlns:wpg="http://schemas.microsoft.com/office/word/2010/wordprocessingGroup" xmlns:wpi="http://schemas.microsoft.com/office/word/2010/wordprocessingInk" xmlns:wne="http://schemas.microsoft.com/office/word/2006/wordml" xmlns:wps="http://schemas.microsoft.com/office/word/2010/wordprocessingShape" mc:Ignorable="w14 w15 w16se w16cid wp14">
   <w:abstractNum w:abstractNumId="0" w15:restartNumberingAfterBreak="0">
     <w:nsid w:val="0B723877"/>
@@ -5451,7 +5617,57 @@
 </w:numbering>
 </file>
 
-<file path=word/styles.xml><?xml version="1.0" encoding="utf-8"?>
+<file path=word\settings.xml><?xml version="1.0" encoding="utf-8"?>
+<w:settings xmlns:mc="http://schemas.openxmlformats.org/markup-compatibility/2006" xmlns:o="urn:schemas-microsoft-com:office:office" xmlns:r="http://schemas.openxmlformats.org/officeDocument/2006/relationships" xmlns:m="http://schemas.openxmlformats.org/officeDocument/2006/math" xmlns:v="urn:schemas-microsoft-com:vml" xmlns:w10="urn:schemas-microsoft-com:office:word" xmlns:w="http://schemas.openxmlformats.org/wordprocessingml/2006/main" xmlns:w14="http://schemas.microsoft.com/office/word/2010/wordml" xmlns:w15="http://schemas.microsoft.com/office/word/2012/wordml" xmlns:w16cid="http://schemas.microsoft.com/office/word/2016/wordml/cid" xmlns:w16se="http://schemas.microsoft.com/office/word/2015/wordml/symex" xmlns:sl="http://schemas.openxmlformats.org/schemaLibrary/2006/main" mc:Ignorable="w14 w15 w16se w16cid">
+  <w:zoom w:percent="100"/>
+  <w:defaultTabStop w:val="720"/>
+  <w:characterSpacingControl w:val="doNotCompress"/>
+  <w:compat>
+    <w:compatSetting w:name="compatibilityMode" w:uri="http://schemas.microsoft.com/office/word" w:val="15"/>
+    <w:compatSetting w:name="overrideTableStyleFontSizeAndJustification" w:uri="http://schemas.microsoft.com/office/word" w:val="1"/>
+    <w:compatSetting w:name="enableOpenTypeFeatures" w:uri="http://schemas.microsoft.com/office/word" w:val="1"/>
+    <w:compatSetting w:name="doNotFlipMirrorIndents" w:uri="http://schemas.microsoft.com/office/word" w:val="1"/>
+    <w:compatSetting w:name="differentiateMultirowTableHeaders" w:uri="http://schemas.microsoft.com/office/word" w:val="1"/>
+    <w:compatSetting w:name="useWord2013TrackBottomHyphenation" w:uri="http://schemas.microsoft.com/office/word" w:val="0"/>
+  </w:compat>
+  <w:rsids>
+    <w:rsidRoot w:val="003944DC"/>
+    <w:rsid w:val="0015733A"/>
+    <w:rsid w:val="003944DC"/>
+    <w:rsid w:val="00654F19"/>
+    <w:rsid w:val="008E0842"/>
+    <w:rsid w:val="00C32A39"/>
+    <w:rsid w:val="00CE5A94"/>
+  </w:rsids>
+  <m:mathPr>
+    <m:mathFont m:val="Cambria Math"/>
+    <m:brkBin m:val="before"/>
+    <m:brkBinSub m:val="--"/>
+    <m:smallFrac m:val="0"/>
+    <m:dispDef/>
+    <m:lMargin m:val="0"/>
+    <m:rMargin m:val="0"/>
+    <m:defJc m:val="centerGroup"/>
+    <m:wrapIndent m:val="1440"/>
+    <m:intLim m:val="subSup"/>
+    <m:naryLim m:val="undOvr"/>
+  </m:mathPr>
+  <w:themeFontLang w:val="en-US"/>
+  <w:clrSchemeMapping w:bg1="light1" w:t1="dark1" w:bg2="light2" w:t2="dark2" w:accent1="accent1" w:accent2="accent2" w:accent3="accent3" w:accent4="accent4" w:accent5="accent5" w:accent6="accent6" w:hyperlink="hyperlink" w:followedHyperlink="followedHyperlink"/>
+  <w:shapeDefaults>
+    <o:shapedefaults v:ext="edit" spidmax="1026"/>
+    <o:shapelayout v:ext="edit">
+      <o:idmap v:ext="edit" data="1"/>
+    </o:shapelayout>
+  </w:shapeDefaults>
+  <w:decimalSymbol w:val="."/>
+  <w:listSeparator w:val=","/>
+  <w15:chartTrackingRefBased/>
+  <w15:docId w15:val="{8DD48DAD-A716-415E-B94F-9F039038F69F}"/>
+</w:settings>
+</file>
+
+<file path=word\styles.xml><?xml version="1.0" encoding="utf-8"?>
 <w:styles xmlns:mc="http://schemas.openxmlformats.org/markup-compatibility/2006" xmlns:r="http://schemas.openxmlformats.org/officeDocument/2006/relationships" xmlns:w="http://schemas.openxmlformats.org/wordprocessingml/2006/main" xmlns:w14="http://schemas.microsoft.com/office/word/2010/wordml" xmlns:w15="http://schemas.microsoft.com/office/word/2012/wordml" xmlns:w16cid="http://schemas.microsoft.com/office/word/2016/wordml/cid" xmlns:w16se="http://schemas.microsoft.com/office/word/2015/wordml/symex" mc:Ignorable="w14 w15 w16se w16cid">
   <w:docDefaults>
     <w:rPrDefault>
@@ -5978,7 +6194,7 @@
 </w:styles>
 </file>
 
-<file path=word/theme/theme1.xml><?xml version="1.0" encoding="utf-8"?>
+<file path=word\theme\theme1.xml><?xml version="1.0" encoding="utf-8"?>
 <a:theme xmlns:a="http://schemas.openxmlformats.org/drawingml/2006/main" name="Office Theme">
   <a:themeElements>
     <a:clrScheme name="Office">
@@ -6271,4 +6487,65 @@
     </a:ext>
   </a:extLst>
 </a:theme>
+</file>
+
+<file path=word\webSettings.xml><?xml version="1.0" encoding="utf-8"?>
+<w:webSettings xmlns:mc="http://schemas.openxmlformats.org/markup-compatibility/2006" xmlns:r="http://schemas.openxmlformats.org/officeDocument/2006/relationships" xmlns:w="http://schemas.openxmlformats.org/wordprocessingml/2006/main" xmlns:w14="http://schemas.microsoft.com/office/word/2010/wordml" xmlns:w15="http://schemas.microsoft.com/office/word/2012/wordml" xmlns:w16cid="http://schemas.microsoft.com/office/word/2016/wordml/cid" xmlns:w16se="http://schemas.microsoft.com/office/word/2015/wordml/symex" mc:Ignorable="w14 w15 w16se w16cid">
+  <w:divs>
+    <w:div w:id="1037853207">
+      <w:bodyDiv w:val="1"/>
+      <w:marLeft w:val="0"/>
+      <w:marRight w:val="0"/>
+      <w:marTop w:val="0"/>
+      <w:marBottom w:val="0"/>
+      <w:divBdr>
+        <w:top w:val="none" w:sz="0" w:space="0" w:color="auto"/>
+        <w:left w:val="none" w:sz="0" w:space="0" w:color="auto"/>
+        <w:bottom w:val="none" w:sz="0" w:space="0" w:color="auto"/>
+        <w:right w:val="none" w:sz="0" w:space="0" w:color="auto"/>
+      </w:divBdr>
+    </w:div>
+    <w:div w:id="1181355296">
+      <w:bodyDiv w:val="1"/>
+      <w:marLeft w:val="0"/>
+      <w:marRight w:val="0"/>
+      <w:marTop w:val="0"/>
+      <w:marBottom w:val="0"/>
+      <w:divBdr>
+        <w:top w:val="none" w:sz="0" w:space="0" w:color="auto"/>
+        <w:left w:val="none" w:sz="0" w:space="0" w:color="auto"/>
+        <w:bottom w:val="none" w:sz="0" w:space="0" w:color="auto"/>
+        <w:right w:val="none" w:sz="0" w:space="0" w:color="auto"/>
+      </w:divBdr>
+    </w:div>
+    <w:div w:id="1952740313">
+      <w:bodyDiv w:val="1"/>
+      <w:marLeft w:val="0"/>
+      <w:marRight w:val="0"/>
+      <w:marTop w:val="0"/>
+      <w:marBottom w:val="0"/>
+      <w:divBdr>
+        <w:top w:val="none" w:sz="0" w:space="0" w:color="auto"/>
+        <w:left w:val="none" w:sz="0" w:space="0" w:color="auto"/>
+        <w:bottom w:val="none" w:sz="0" w:space="0" w:color="auto"/>
+        <w:right w:val="none" w:sz="0" w:space="0" w:color="auto"/>
+      </w:divBdr>
+    </w:div>
+    <w:div w:id="2093625106">
+      <w:bodyDiv w:val="1"/>
+      <w:marLeft w:val="0"/>
+      <w:marRight w:val="0"/>
+      <w:marTop w:val="0"/>
+      <w:marBottom w:val="0"/>
+      <w:divBdr>
+        <w:top w:val="none" w:sz="0" w:space="0" w:color="auto"/>
+        <w:left w:val="none" w:sz="0" w:space="0" w:color="auto"/>
+        <w:bottom w:val="none" w:sz="0" w:space="0" w:color="auto"/>
+        <w:right w:val="none" w:sz="0" w:space="0" w:color="auto"/>
+      </w:divBdr>
+    </w:div>
+  </w:divs>
+  <w:optimizeForBrowser/>
+  <w:allowPNG/>
+</w:webSettings>
 </file>
</xml_diff>